<commit_message>
chore: initial import of Nexus project
</commit_message>
<xml_diff>
--- a/docs/2026中国高校计算机大赛人工智能创意赛初赛（鸿蒙赛道）作品说明文档模板.docx
+++ b/docs/2026中国高校计算机大赛人工智能创意赛初赛（鸿蒙赛道）作品说明文档模板.docx
@@ -1,6 +1,6 @@
 
 <file path=word/document.xml><?xml version="1.0" encoding="utf-8"?>
-<w:document xmlns:wpc="http://schemas.microsoft.com/office/word/2010/wordprocessingCanvas" xmlns:cx="http://schemas.microsoft.com/office/drawing/2014/chartex" xmlns:cx1="http://schemas.microsoft.com/office/drawing/2015/9/8/chartex" xmlns:cx2="http://schemas.microsoft.com/office/drawing/2015/10/21/chartex" xmlns:cx3="http://schemas.microsoft.com/office/drawing/2016/5/9/chartex" xmlns:cx4="http://schemas.microsoft.com/office/drawing/2016/5/10/chartex" xmlns:cx5="http://schemas.microsoft.com/office/drawing/2016/5/11/chartex" xmlns:cx6="http://schemas.microsoft.com/office/drawing/2016/5/12/chartex" xmlns:cx7="http://schemas.microsoft.com/office/drawing/2016/5/13/chartex" xmlns:cx8="http://schemas.microsoft.com/office/drawing/2016/5/14/chartex" xmlns:mc="http://schemas.openxmlformats.org/markup-compatibility/2006" xmlns:aink="http://schemas.microsoft.com/office/drawing/2016/ink" xmlns:am3d="http://schemas.microsoft.com/office/drawing/2017/model3d" xmlns:o="urn:schemas-microsoft-com:office:office" xmlns:r="http://schemas.openxmlformats.org/officeDocument/2006/relationships" xmlns:m="http://schemas.openxmlformats.org/officeDocument/2006/math" xmlns:v="urn:schemas-microsoft-com:vml" xmlns:wp14="http://schemas.microsoft.com/office/word/2010/wordprocessingDrawing" xmlns:wp="http://schemas.openxmlformats.org/drawingml/2006/wordprocessingDrawing" xmlns:w10="urn:schemas-microsoft-com:office:word" xmlns:w="http://schemas.openxmlformats.org/wordprocessingml/2006/main" xmlns:w14="http://schemas.microsoft.com/office/word/2010/wordml" xmlns:w15="http://schemas.microsoft.com/office/word/2012/wordml" xmlns:w16cid="http://schemas.microsoft.com/office/word/2016/wordml/cid" xmlns:w16se="http://schemas.microsoft.com/office/word/2015/wordml/symex" xmlns:wpg="http://schemas.microsoft.com/office/word/2010/wordprocessingGroup" xmlns:wpi="http://schemas.microsoft.com/office/word/2010/wordprocessingInk" xmlns:wne="http://schemas.microsoft.com/office/word/2006/wordml" xmlns:wps="http://schemas.microsoft.com/office/word/2010/wordprocessingShape" mc:Ignorable="w14 w15 w16se w16cid wp14">
+<w:document xmlns:wpc="http://schemas.microsoft.com/office/word/2010/wordprocessingCanvas" xmlns:cx="http://schemas.microsoft.com/office/drawing/2014/chartex" xmlns:cx1="http://schemas.microsoft.com/office/drawing/2015/9/8/chartex" xmlns:cx2="http://schemas.microsoft.com/office/drawing/2015/10/21/chartex" xmlns:cx3="http://schemas.microsoft.com/office/drawing/2016/5/9/chartex" xmlns:cx4="http://schemas.microsoft.com/office/drawing/2016/5/10/chartex" xmlns:cx5="http://schemas.microsoft.com/office/drawing/2016/5/11/chartex" xmlns:cx6="http://schemas.microsoft.com/office/drawing/2016/5/12/chartex" xmlns:cx7="http://schemas.microsoft.com/office/drawing/2016/5/13/chartex" xmlns:cx8="http://schemas.microsoft.com/office/drawing/2016/5/14/chartex" xmlns:mc="http://schemas.openxmlformats.org/markup-compatibility/2006" xmlns:aink="http://schemas.microsoft.com/office/drawing/2016/ink" xmlns:am3d="http://schemas.microsoft.com/office/drawing/2017/model3d" xmlns:o="urn:schemas-microsoft-com:office:office" xmlns:oel="http://schemas.microsoft.com/office/2019/extlst" xmlns:r="http://schemas.openxmlformats.org/officeDocument/2006/relationships" xmlns:m="http://schemas.openxmlformats.org/officeDocument/2006/math" xmlns:v="urn:schemas-microsoft-com:vml" xmlns:wp14="http://schemas.microsoft.com/office/word/2010/wordprocessingDrawing" xmlns:wp="http://schemas.openxmlformats.org/drawingml/2006/wordprocessingDrawing" xmlns:w10="urn:schemas-microsoft-com:office:word" xmlns:w="http://schemas.openxmlformats.org/wordprocessingml/2006/main" xmlns:w14="http://schemas.microsoft.com/office/word/2010/wordml" xmlns:w15="http://schemas.microsoft.com/office/word/2012/wordml" xmlns:w16cex="http://schemas.microsoft.com/office/word/2018/wordml/cex" xmlns:w16cid="http://schemas.microsoft.com/office/word/2016/wordml/cid" xmlns:w16="http://schemas.microsoft.com/office/word/2018/wordml" xmlns:w16du="http://schemas.microsoft.com/office/word/2023/wordml/word16du" xmlns:w16sdtdh="http://schemas.microsoft.com/office/word/2020/wordml/sdtdatahash" xmlns:w16sdtfl="http://schemas.microsoft.com/office/word/2024/wordml/sdtformatlock" xmlns:w16se="http://schemas.microsoft.com/office/word/2015/wordml/symex" xmlns:wpg="http://schemas.microsoft.com/office/word/2010/wordprocessingGroup" xmlns:wpi="http://schemas.microsoft.com/office/word/2010/wordprocessingInk" xmlns:wne="http://schemas.microsoft.com/office/word/2006/wordml" xmlns:wps="http://schemas.microsoft.com/office/word/2010/wordprocessingShape" mc:Ignorable="w14 w15 w16se w16cid w16 w16cex w16sdtdh w16sdtfl w16du wp14">
   <w:body>
     <w:p>
       <w:pPr>
@@ -64,18 +64,7 @@
           <w:sz w:val="56"/>
           <w:szCs w:val="56"/>
         </w:rPr>
-        <w:t>鸿蒙赛道作品说明文档（初赛</w:t>
-      </w:r>
-      <w:bookmarkStart w:id="0" w:name="_GoBack"/>
-      <w:bookmarkEnd w:id="0"/>
-      <w:r>
-        <w:rPr>
-          <w:rFonts w:ascii="HarmonyOS Sans SC" w:eastAsia="HarmonyOS Sans SC" w:hAnsi="HarmonyOS Sans SC" w:hint="eastAsia"/>
-          <w:b/>
-          <w:sz w:val="56"/>
-          <w:szCs w:val="56"/>
-        </w:rPr>
-        <w:t>）</w:t>
+        <w:t>鸿蒙赛道作品说明文档（初赛）</w:t>
       </w:r>
     </w:p>
     <w:p>
@@ -887,19 +876,11 @@
             </w:pPr>
             <w:r>
               <w:rPr>
-                <w:rFonts w:ascii="HarmonyOS Sans SC" w:eastAsia="HarmonyOS Sans SC" w:hAnsi="HarmonyOS Sans SC"/>
+                <w:rFonts w:ascii="HarmonyOS Sans SC" w:eastAsia="HarmonyOS Sans SC" w:hAnsi="HarmonyOS Sans SC" w:hint="eastAsia"/>
                 <w:color w:val="808080" w:themeColor="background1" w:themeShade="80"/>
                 <w:sz w:val="22"/>
               </w:rPr>
-              <w:t>3</w:t>
-            </w:r>
-            <w:r>
-              <w:rPr>
-                <w:rFonts w:ascii="HarmonyOS Sans SC" w:eastAsia="HarmonyOS Sans SC" w:hAnsi="HarmonyOS Sans SC" w:hint="eastAsia"/>
-                <w:color w:val="808080" w:themeColor="background1" w:themeShade="80"/>
-                <w:sz w:val="22"/>
-              </w:rPr>
-              <w:t>0个字符以内，中英文皆可</w:t>
+              <w:t>Nexus</w:t>
             </w:r>
           </w:p>
         </w:tc>
@@ -1548,25 +1529,14 @@
                 <w:szCs w:val="20"/>
               </w:rPr>
             </w:pPr>
-            <w:proofErr w:type="gramStart"/>
-            <w:r>
-              <w:rPr>
-                <w:rFonts w:ascii="HarmonyOS Sans SC" w:eastAsia="HarmonyOS Sans SC" w:hAnsi="HarmonyOS Sans SC" w:hint="eastAsia"/>
-                <w:color w:val="808080" w:themeColor="background1" w:themeShade="80"/>
-                <w:sz w:val="20"/>
-                <w:szCs w:val="20"/>
-              </w:rPr>
-              <w:t>研</w:t>
-            </w:r>
-            <w:proofErr w:type="gramEnd"/>
-            <w:r>
-              <w:rPr>
-                <w:rFonts w:ascii="HarmonyOS Sans SC" w:eastAsia="HarmonyOS Sans SC" w:hAnsi="HarmonyOS Sans SC" w:hint="eastAsia"/>
-                <w:color w:val="808080" w:themeColor="background1" w:themeShade="80"/>
-                <w:sz w:val="20"/>
-                <w:szCs w:val="20"/>
-              </w:rPr>
-              <w:t>二</w:t>
+            <w:r>
+              <w:rPr>
+                <w:rFonts w:ascii="HarmonyOS Sans SC" w:eastAsia="HarmonyOS Sans SC" w:hAnsi="HarmonyOS Sans SC" w:hint="eastAsia"/>
+                <w:color w:val="808080" w:themeColor="background1" w:themeShade="80"/>
+                <w:sz w:val="20"/>
+                <w:szCs w:val="20"/>
+              </w:rPr>
+              <w:t>研二</w:t>
             </w:r>
           </w:p>
         </w:tc>
@@ -3447,29 +3417,7 @@
           <w:sz w:val="24"/>
           <w:szCs w:val="24"/>
         </w:rPr>
-        <w:t>（注：本页签名可以打印纸</w:t>
-      </w:r>
-      <w:proofErr w:type="gramStart"/>
-      <w:r>
-        <w:rPr>
-          <w:rFonts w:ascii="HarmonyOS Sans SC" w:eastAsia="HarmonyOS Sans SC" w:hAnsi="HarmonyOS Sans SC" w:hint="eastAsia"/>
-          <w:bCs/>
-          <w:color w:val="767171" w:themeColor="background2" w:themeShade="80"/>
-          <w:sz w:val="24"/>
-          <w:szCs w:val="24"/>
-        </w:rPr>
-        <w:t>质文件</w:t>
-      </w:r>
-      <w:proofErr w:type="gramEnd"/>
-      <w:r>
-        <w:rPr>
-          <w:rFonts w:ascii="HarmonyOS Sans SC" w:eastAsia="HarmonyOS Sans SC" w:hAnsi="HarmonyOS Sans SC" w:hint="eastAsia"/>
-          <w:bCs/>
-          <w:color w:val="767171" w:themeColor="background2" w:themeShade="80"/>
-          <w:sz w:val="24"/>
-          <w:szCs w:val="24"/>
-        </w:rPr>
-        <w:t>后签名，提供扫描件；或者使用电子签名。不论哪种方式，需保证页面内容完整、字迹清晰，请与本项目创意书作为同一文档提交，否则项目创意书提交可能无效。）</w:t>
+        <w:t>（注：本页签名可以打印纸质文件后签名，提供扫描件；或者使用电子签名。不论哪种方式，需保证页面内容完整、字迹清晰，请与本项目创意书作为同一文档提交，否则项目创意书提交可能无效。）</w:t>
       </w:r>
     </w:p>
     <w:p>
@@ -3680,27 +3628,7 @@
           <w:sz w:val="24"/>
           <w:szCs w:val="24"/>
         </w:rPr>
-        <w:t>一句话</w:t>
-      </w:r>
-      <w:proofErr w:type="gramStart"/>
-      <w:r>
-        <w:rPr>
-          <w:rFonts w:ascii="HarmonyOS Sans SC" w:eastAsia="HarmonyOS Sans SC" w:hAnsi="HarmonyOS Sans SC" w:hint="eastAsia"/>
-          <w:color w:val="808080" w:themeColor="background1" w:themeShade="80"/>
-          <w:sz w:val="24"/>
-          <w:szCs w:val="24"/>
-        </w:rPr>
-        <w:t>抽述关键</w:t>
-      </w:r>
-      <w:proofErr w:type="gramEnd"/>
-      <w:r>
-        <w:rPr>
-          <w:rFonts w:ascii="HarmonyOS Sans SC" w:eastAsia="HarmonyOS Sans SC" w:hAnsi="HarmonyOS Sans SC" w:hint="eastAsia"/>
-          <w:color w:val="808080" w:themeColor="background1" w:themeShade="80"/>
-          <w:sz w:val="24"/>
-          <w:szCs w:val="24"/>
-        </w:rPr>
-        <w:t>创新点，不超过3</w:t>
+        <w:t>一句话抽述关键创新点，不超过3</w:t>
       </w:r>
       <w:r>
         <w:rPr>
@@ -4219,25 +4147,7 @@
           <w:sz w:val="24"/>
           <w:szCs w:val="24"/>
         </w:rPr>
-        <w:t>（三）行距：单</w:t>
-      </w:r>
-      <w:proofErr w:type="gramStart"/>
-      <w:r>
-        <w:rPr>
-          <w:rFonts w:ascii="HarmonyOS Sans SC" w:eastAsia="HarmonyOS Sans SC" w:hAnsi="HarmonyOS Sans SC" w:hint="eastAsia"/>
-          <w:sz w:val="24"/>
-          <w:szCs w:val="24"/>
-        </w:rPr>
-        <w:t>倍</w:t>
-      </w:r>
-      <w:proofErr w:type="gramEnd"/>
-      <w:r>
-        <w:rPr>
-          <w:rFonts w:ascii="HarmonyOS Sans SC" w:eastAsia="HarmonyOS Sans SC" w:hAnsi="HarmonyOS Sans SC" w:hint="eastAsia"/>
-          <w:sz w:val="24"/>
-          <w:szCs w:val="24"/>
-        </w:rPr>
-        <w:t>行距</w:t>
+        <w:t>（三）行距：单倍行距</w:t>
       </w:r>
     </w:p>
     <w:p>
@@ -4687,7 +4597,7 @@
 </file>
 
 <file path=word/endnotes.xml><?xml version="1.0" encoding="utf-8"?>
-<w:endnotes xmlns:wpc="http://schemas.microsoft.com/office/word/2010/wordprocessingCanvas" xmlns:cx="http://schemas.microsoft.com/office/drawing/2014/chartex" xmlns:cx1="http://schemas.microsoft.com/office/drawing/2015/9/8/chartex" xmlns:cx2="http://schemas.microsoft.com/office/drawing/2015/10/21/chartex" xmlns:cx3="http://schemas.microsoft.com/office/drawing/2016/5/9/chartex" xmlns:cx4="http://schemas.microsoft.com/office/drawing/2016/5/10/chartex" xmlns:cx5="http://schemas.microsoft.com/office/drawing/2016/5/11/chartex" xmlns:cx6="http://schemas.microsoft.com/office/drawing/2016/5/12/chartex" xmlns:cx7="http://schemas.microsoft.com/office/drawing/2016/5/13/chartex" xmlns:cx8="http://schemas.microsoft.com/office/drawing/2016/5/14/chartex" xmlns:mc="http://schemas.openxmlformats.org/markup-compatibility/2006" xmlns:aink="http://schemas.microsoft.com/office/drawing/2016/ink" xmlns:am3d="http://schemas.microsoft.com/office/drawing/2017/model3d" xmlns:o="urn:schemas-microsoft-com:office:office" xmlns:r="http://schemas.openxmlformats.org/officeDocument/2006/relationships" xmlns:m="http://schemas.openxmlformats.org/officeDocument/2006/math" xmlns:v="urn:schemas-microsoft-com:vml" xmlns:wp14="http://schemas.microsoft.com/office/word/2010/wordprocessingDrawing" xmlns:wp="http://schemas.openxmlformats.org/drawingml/2006/wordprocessingDrawing" xmlns:w10="urn:schemas-microsoft-com:office:word" xmlns:w="http://schemas.openxmlformats.org/wordprocessingml/2006/main" xmlns:w14="http://schemas.microsoft.com/office/word/2010/wordml" xmlns:w15="http://schemas.microsoft.com/office/word/2012/wordml" xmlns:w16cid="http://schemas.microsoft.com/office/word/2016/wordml/cid" xmlns:w16se="http://schemas.microsoft.com/office/word/2015/wordml/symex" xmlns:wpg="http://schemas.microsoft.com/office/word/2010/wordprocessingGroup" xmlns:wpi="http://schemas.microsoft.com/office/word/2010/wordprocessingInk" xmlns:wne="http://schemas.microsoft.com/office/word/2006/wordml" xmlns:wps="http://schemas.microsoft.com/office/word/2010/wordprocessingShape" mc:Ignorable="w14 w15 w16se w16cid wp14">
+<w:endnotes xmlns:wpc="http://schemas.microsoft.com/office/word/2010/wordprocessingCanvas" xmlns:cx="http://schemas.microsoft.com/office/drawing/2014/chartex" xmlns:cx1="http://schemas.microsoft.com/office/drawing/2015/9/8/chartex" xmlns:cx2="http://schemas.microsoft.com/office/drawing/2015/10/21/chartex" xmlns:cx3="http://schemas.microsoft.com/office/drawing/2016/5/9/chartex" xmlns:cx4="http://schemas.microsoft.com/office/drawing/2016/5/10/chartex" xmlns:cx5="http://schemas.microsoft.com/office/drawing/2016/5/11/chartex" xmlns:cx6="http://schemas.microsoft.com/office/drawing/2016/5/12/chartex" xmlns:cx7="http://schemas.microsoft.com/office/drawing/2016/5/13/chartex" xmlns:cx8="http://schemas.microsoft.com/office/drawing/2016/5/14/chartex" xmlns:mc="http://schemas.openxmlformats.org/markup-compatibility/2006" xmlns:aink="http://schemas.microsoft.com/office/drawing/2016/ink" xmlns:am3d="http://schemas.microsoft.com/office/drawing/2017/model3d" xmlns:o="urn:schemas-microsoft-com:office:office" xmlns:oel="http://schemas.microsoft.com/office/2019/extlst" xmlns:r="http://schemas.openxmlformats.org/officeDocument/2006/relationships" xmlns:m="http://schemas.openxmlformats.org/officeDocument/2006/math" xmlns:v="urn:schemas-microsoft-com:vml" xmlns:wp14="http://schemas.microsoft.com/office/word/2010/wordprocessingDrawing" xmlns:wp="http://schemas.openxmlformats.org/drawingml/2006/wordprocessingDrawing" xmlns:w10="urn:schemas-microsoft-com:office:word" xmlns:w="http://schemas.openxmlformats.org/wordprocessingml/2006/main" xmlns:w14="http://schemas.microsoft.com/office/word/2010/wordml" xmlns:w15="http://schemas.microsoft.com/office/word/2012/wordml" xmlns:w16cex="http://schemas.microsoft.com/office/word/2018/wordml/cex" xmlns:w16cid="http://schemas.microsoft.com/office/word/2016/wordml/cid" xmlns:w16="http://schemas.microsoft.com/office/word/2018/wordml" xmlns:w16du="http://schemas.microsoft.com/office/word/2023/wordml/word16du" xmlns:w16sdtdh="http://schemas.microsoft.com/office/word/2020/wordml/sdtdatahash" xmlns:w16sdtfl="http://schemas.microsoft.com/office/word/2024/wordml/sdtformatlock" xmlns:w16se="http://schemas.microsoft.com/office/word/2015/wordml/symex" xmlns:wpg="http://schemas.microsoft.com/office/word/2010/wordprocessingGroup" xmlns:wpi="http://schemas.microsoft.com/office/word/2010/wordprocessingInk" xmlns:wne="http://schemas.microsoft.com/office/word/2006/wordml" xmlns:wps="http://schemas.microsoft.com/office/word/2010/wordprocessingShape" mc:Ignorable="w14 w15 w16se w16cid w16 w16cex w16sdtdh w16sdtfl w16du wp14">
   <w:endnote w:type="separator" w:id="-1">
     <w:p>
       <w:r>
@@ -4706,7 +4616,7 @@
 </file>
 
 <file path=word/footer1.xml><?xml version="1.0" encoding="utf-8"?>
-<w:ftr xmlns:wpc="http://schemas.microsoft.com/office/word/2010/wordprocessingCanvas" xmlns:cx="http://schemas.microsoft.com/office/drawing/2014/chartex" xmlns:cx1="http://schemas.microsoft.com/office/drawing/2015/9/8/chartex" xmlns:cx2="http://schemas.microsoft.com/office/drawing/2015/10/21/chartex" xmlns:cx3="http://schemas.microsoft.com/office/drawing/2016/5/9/chartex" xmlns:cx4="http://schemas.microsoft.com/office/drawing/2016/5/10/chartex" xmlns:cx5="http://schemas.microsoft.com/office/drawing/2016/5/11/chartex" xmlns:cx6="http://schemas.microsoft.com/office/drawing/2016/5/12/chartex" xmlns:cx7="http://schemas.microsoft.com/office/drawing/2016/5/13/chartex" xmlns:cx8="http://schemas.microsoft.com/office/drawing/2016/5/14/chartex" xmlns:mc="http://schemas.openxmlformats.org/markup-compatibility/2006" xmlns:aink="http://schemas.microsoft.com/office/drawing/2016/ink" xmlns:am3d="http://schemas.microsoft.com/office/drawing/2017/model3d" xmlns:o="urn:schemas-microsoft-com:office:office" xmlns:r="http://schemas.openxmlformats.org/officeDocument/2006/relationships" xmlns:m="http://schemas.openxmlformats.org/officeDocument/2006/math" xmlns:v="urn:schemas-microsoft-com:vml" xmlns:wp14="http://schemas.microsoft.com/office/word/2010/wordprocessingDrawing" xmlns:wp="http://schemas.openxmlformats.org/drawingml/2006/wordprocessingDrawing" xmlns:w10="urn:schemas-microsoft-com:office:word" xmlns:w="http://schemas.openxmlformats.org/wordprocessingml/2006/main" xmlns:w14="http://schemas.microsoft.com/office/word/2010/wordml" xmlns:w15="http://schemas.microsoft.com/office/word/2012/wordml" xmlns:w16cid="http://schemas.microsoft.com/office/word/2016/wordml/cid" xmlns:w16se="http://schemas.microsoft.com/office/word/2015/wordml/symex" xmlns:wpg="http://schemas.microsoft.com/office/word/2010/wordprocessingGroup" xmlns:wpi="http://schemas.microsoft.com/office/word/2010/wordprocessingInk" xmlns:wne="http://schemas.microsoft.com/office/word/2006/wordml" xmlns:wps="http://schemas.microsoft.com/office/word/2010/wordprocessingShape" mc:Ignorable="w14 w15 w16se w16cid wp14">
+<w:ftr xmlns:wpc="http://schemas.microsoft.com/office/word/2010/wordprocessingCanvas" xmlns:cx="http://schemas.microsoft.com/office/drawing/2014/chartex" xmlns:cx1="http://schemas.microsoft.com/office/drawing/2015/9/8/chartex" xmlns:cx2="http://schemas.microsoft.com/office/drawing/2015/10/21/chartex" xmlns:cx3="http://schemas.microsoft.com/office/drawing/2016/5/9/chartex" xmlns:cx4="http://schemas.microsoft.com/office/drawing/2016/5/10/chartex" xmlns:cx5="http://schemas.microsoft.com/office/drawing/2016/5/11/chartex" xmlns:cx6="http://schemas.microsoft.com/office/drawing/2016/5/12/chartex" xmlns:cx7="http://schemas.microsoft.com/office/drawing/2016/5/13/chartex" xmlns:cx8="http://schemas.microsoft.com/office/drawing/2016/5/14/chartex" xmlns:mc="http://schemas.openxmlformats.org/markup-compatibility/2006" xmlns:aink="http://schemas.microsoft.com/office/drawing/2016/ink" xmlns:am3d="http://schemas.microsoft.com/office/drawing/2017/model3d" xmlns:o="urn:schemas-microsoft-com:office:office" xmlns:oel="http://schemas.microsoft.com/office/2019/extlst" xmlns:r="http://schemas.openxmlformats.org/officeDocument/2006/relationships" xmlns:m="http://schemas.openxmlformats.org/officeDocument/2006/math" xmlns:v="urn:schemas-microsoft-com:vml" xmlns:wp14="http://schemas.microsoft.com/office/word/2010/wordprocessingDrawing" xmlns:wp="http://schemas.openxmlformats.org/drawingml/2006/wordprocessingDrawing" xmlns:w10="urn:schemas-microsoft-com:office:word" xmlns:w="http://schemas.openxmlformats.org/wordprocessingml/2006/main" xmlns:w14="http://schemas.microsoft.com/office/word/2010/wordml" xmlns:w15="http://schemas.microsoft.com/office/word/2012/wordml" xmlns:w16cex="http://schemas.microsoft.com/office/word/2018/wordml/cex" xmlns:w16cid="http://schemas.microsoft.com/office/word/2016/wordml/cid" xmlns:w16="http://schemas.microsoft.com/office/word/2018/wordml" xmlns:w16du="http://schemas.microsoft.com/office/word/2023/wordml/word16du" xmlns:w16sdtdh="http://schemas.microsoft.com/office/word/2020/wordml/sdtdatahash" xmlns:w16sdtfl="http://schemas.microsoft.com/office/word/2024/wordml/sdtformatlock" xmlns:w16se="http://schemas.microsoft.com/office/word/2015/wordml/symex" xmlns:wpg="http://schemas.microsoft.com/office/word/2010/wordprocessingGroup" xmlns:wpi="http://schemas.microsoft.com/office/word/2010/wordprocessingInk" xmlns:wne="http://schemas.microsoft.com/office/word/2006/wordml" xmlns:wps="http://schemas.microsoft.com/office/word/2010/wordprocessingShape" mc:Ignorable="w14 w15 w16se w16cid w16 w16cex w16sdtdh w16sdtfl w16du wp14">
   <w:p>
     <w:pPr>
       <w:pStyle w:val="a5"/>
@@ -4782,7 +4692,7 @@
 </file>
 
 <file path=word/footnotes.xml><?xml version="1.0" encoding="utf-8"?>
-<w:footnotes xmlns:wpc="http://schemas.microsoft.com/office/word/2010/wordprocessingCanvas" xmlns:cx="http://schemas.microsoft.com/office/drawing/2014/chartex" xmlns:cx1="http://schemas.microsoft.com/office/drawing/2015/9/8/chartex" xmlns:cx2="http://schemas.microsoft.com/office/drawing/2015/10/21/chartex" xmlns:cx3="http://schemas.microsoft.com/office/drawing/2016/5/9/chartex" xmlns:cx4="http://schemas.microsoft.com/office/drawing/2016/5/10/chartex" xmlns:cx5="http://schemas.microsoft.com/office/drawing/2016/5/11/chartex" xmlns:cx6="http://schemas.microsoft.com/office/drawing/2016/5/12/chartex" xmlns:cx7="http://schemas.microsoft.com/office/drawing/2016/5/13/chartex" xmlns:cx8="http://schemas.microsoft.com/office/drawing/2016/5/14/chartex" xmlns:mc="http://schemas.openxmlformats.org/markup-compatibility/2006" xmlns:aink="http://schemas.microsoft.com/office/drawing/2016/ink" xmlns:am3d="http://schemas.microsoft.com/office/drawing/2017/model3d" xmlns:o="urn:schemas-microsoft-com:office:office" xmlns:r="http://schemas.openxmlformats.org/officeDocument/2006/relationships" xmlns:m="http://schemas.openxmlformats.org/officeDocument/2006/math" xmlns:v="urn:schemas-microsoft-com:vml" xmlns:wp14="http://schemas.microsoft.com/office/word/2010/wordprocessingDrawing" xmlns:wp="http://schemas.openxmlformats.org/drawingml/2006/wordprocessingDrawing" xmlns:w10="urn:schemas-microsoft-com:office:word" xmlns:w="http://schemas.openxmlformats.org/wordprocessingml/2006/main" xmlns:w14="http://schemas.microsoft.com/office/word/2010/wordml" xmlns:w15="http://schemas.microsoft.com/office/word/2012/wordml" xmlns:w16cid="http://schemas.microsoft.com/office/word/2016/wordml/cid" xmlns:w16se="http://schemas.microsoft.com/office/word/2015/wordml/symex" xmlns:wpg="http://schemas.microsoft.com/office/word/2010/wordprocessingGroup" xmlns:wpi="http://schemas.microsoft.com/office/word/2010/wordprocessingInk" xmlns:wne="http://schemas.microsoft.com/office/word/2006/wordml" xmlns:wps="http://schemas.microsoft.com/office/word/2010/wordprocessingShape" mc:Ignorable="w14 w15 w16se w16cid wp14">
+<w:footnotes xmlns:wpc="http://schemas.microsoft.com/office/word/2010/wordprocessingCanvas" xmlns:cx="http://schemas.microsoft.com/office/drawing/2014/chartex" xmlns:cx1="http://schemas.microsoft.com/office/drawing/2015/9/8/chartex" xmlns:cx2="http://schemas.microsoft.com/office/drawing/2015/10/21/chartex" xmlns:cx3="http://schemas.microsoft.com/office/drawing/2016/5/9/chartex" xmlns:cx4="http://schemas.microsoft.com/office/drawing/2016/5/10/chartex" xmlns:cx5="http://schemas.microsoft.com/office/drawing/2016/5/11/chartex" xmlns:cx6="http://schemas.microsoft.com/office/drawing/2016/5/12/chartex" xmlns:cx7="http://schemas.microsoft.com/office/drawing/2016/5/13/chartex" xmlns:cx8="http://schemas.microsoft.com/office/drawing/2016/5/14/chartex" xmlns:mc="http://schemas.openxmlformats.org/markup-compatibility/2006" xmlns:aink="http://schemas.microsoft.com/office/drawing/2016/ink" xmlns:am3d="http://schemas.microsoft.com/office/drawing/2017/model3d" xmlns:o="urn:schemas-microsoft-com:office:office" xmlns:oel="http://schemas.microsoft.com/office/2019/extlst" xmlns:r="http://schemas.openxmlformats.org/officeDocument/2006/relationships" xmlns:m="http://schemas.openxmlformats.org/officeDocument/2006/math" xmlns:v="urn:schemas-microsoft-com:vml" xmlns:wp14="http://schemas.microsoft.com/office/word/2010/wordprocessingDrawing" xmlns:wp="http://schemas.openxmlformats.org/drawingml/2006/wordprocessingDrawing" xmlns:w10="urn:schemas-microsoft-com:office:word" xmlns:w="http://schemas.openxmlformats.org/wordprocessingml/2006/main" xmlns:w14="http://schemas.microsoft.com/office/word/2010/wordml" xmlns:w15="http://schemas.microsoft.com/office/word/2012/wordml" xmlns:w16cex="http://schemas.microsoft.com/office/word/2018/wordml/cex" xmlns:w16cid="http://schemas.microsoft.com/office/word/2016/wordml/cid" xmlns:w16="http://schemas.microsoft.com/office/word/2018/wordml" xmlns:w16du="http://schemas.microsoft.com/office/word/2023/wordml/word16du" xmlns:w16sdtdh="http://schemas.microsoft.com/office/word/2020/wordml/sdtdatahash" xmlns:w16sdtfl="http://schemas.microsoft.com/office/word/2024/wordml/sdtformatlock" xmlns:w16se="http://schemas.microsoft.com/office/word/2015/wordml/symex" xmlns:wpg="http://schemas.microsoft.com/office/word/2010/wordprocessingGroup" xmlns:wpi="http://schemas.microsoft.com/office/word/2010/wordprocessingInk" xmlns:wne="http://schemas.microsoft.com/office/word/2006/wordml" xmlns:wps="http://schemas.microsoft.com/office/word/2010/wordprocessingShape" mc:Ignorable="w14 w15 w16se w16cid w16 w16cex w16sdtdh w16sdtfl w16du wp14">
   <w:footnote w:type="separator" w:id="-1">
     <w:p>
       <w:r>
@@ -4801,7 +4711,7 @@
 </file>
 
 <file path=word/numbering.xml><?xml version="1.0" encoding="utf-8"?>
-<w:numbering xmlns:wpc="http://schemas.microsoft.com/office/word/2010/wordprocessingCanvas" xmlns:cx="http://schemas.microsoft.com/office/drawing/2014/chartex" xmlns:cx1="http://schemas.microsoft.com/office/drawing/2015/9/8/chartex" xmlns:cx2="http://schemas.microsoft.com/office/drawing/2015/10/21/chartex" xmlns:cx3="http://schemas.microsoft.com/office/drawing/2016/5/9/chartex" xmlns:cx4="http://schemas.microsoft.com/office/drawing/2016/5/10/chartex" xmlns:cx5="http://schemas.microsoft.com/office/drawing/2016/5/11/chartex" xmlns:cx6="http://schemas.microsoft.com/office/drawing/2016/5/12/chartex" xmlns:cx7="http://schemas.microsoft.com/office/drawing/2016/5/13/chartex" xmlns:cx8="http://schemas.microsoft.com/office/drawing/2016/5/14/chartex" xmlns:mc="http://schemas.openxmlformats.org/markup-compatibility/2006" xmlns:aink="http://schemas.microsoft.com/office/drawing/2016/ink" xmlns:am3d="http://schemas.microsoft.com/office/drawing/2017/model3d" xmlns:o="urn:schemas-microsoft-com:office:office" xmlns:r="http://schemas.openxmlformats.org/officeDocument/2006/relationships" xmlns:m="http://schemas.openxmlformats.org/officeDocument/2006/math" xmlns:v="urn:schemas-microsoft-com:vml" xmlns:wp14="http://schemas.microsoft.com/office/word/2010/wordprocessingDrawing" xmlns:wp="http://schemas.openxmlformats.org/drawingml/2006/wordprocessingDrawing" xmlns:w10="urn:schemas-microsoft-com:office:word" xmlns:w="http://schemas.openxmlformats.org/wordprocessingml/2006/main" xmlns:w14="http://schemas.microsoft.com/office/word/2010/wordml" xmlns:w15="http://schemas.microsoft.com/office/word/2012/wordml" xmlns:w16cid="http://schemas.microsoft.com/office/word/2016/wordml/cid" xmlns:w16se="http://schemas.microsoft.com/office/word/2015/wordml/symex" xmlns:wpg="http://schemas.microsoft.com/office/word/2010/wordprocessingGroup" xmlns:wpi="http://schemas.microsoft.com/office/word/2010/wordprocessingInk" xmlns:wne="http://schemas.microsoft.com/office/word/2006/wordml" xmlns:wps="http://schemas.microsoft.com/office/word/2010/wordprocessingShape" mc:Ignorable="w14 w15 w16se w16cid wp14">
+<w:numbering xmlns:wpc="http://schemas.microsoft.com/office/word/2010/wordprocessingCanvas" xmlns:cx="http://schemas.microsoft.com/office/drawing/2014/chartex" xmlns:cx1="http://schemas.microsoft.com/office/drawing/2015/9/8/chartex" xmlns:cx2="http://schemas.microsoft.com/office/drawing/2015/10/21/chartex" xmlns:cx3="http://schemas.microsoft.com/office/drawing/2016/5/9/chartex" xmlns:cx4="http://schemas.microsoft.com/office/drawing/2016/5/10/chartex" xmlns:cx5="http://schemas.microsoft.com/office/drawing/2016/5/11/chartex" xmlns:cx6="http://schemas.microsoft.com/office/drawing/2016/5/12/chartex" xmlns:cx7="http://schemas.microsoft.com/office/drawing/2016/5/13/chartex" xmlns:cx8="http://schemas.microsoft.com/office/drawing/2016/5/14/chartex" xmlns:mc="http://schemas.openxmlformats.org/markup-compatibility/2006" xmlns:aink="http://schemas.microsoft.com/office/drawing/2016/ink" xmlns:am3d="http://schemas.microsoft.com/office/drawing/2017/model3d" xmlns:o="urn:schemas-microsoft-com:office:office" xmlns:oel="http://schemas.microsoft.com/office/2019/extlst" xmlns:r="http://schemas.openxmlformats.org/officeDocument/2006/relationships" xmlns:m="http://schemas.openxmlformats.org/officeDocument/2006/math" xmlns:v="urn:schemas-microsoft-com:vml" xmlns:wp14="http://schemas.microsoft.com/office/word/2010/wordprocessingDrawing" xmlns:wp="http://schemas.openxmlformats.org/drawingml/2006/wordprocessingDrawing" xmlns:w10="urn:schemas-microsoft-com:office:word" xmlns:w="http://schemas.openxmlformats.org/wordprocessingml/2006/main" xmlns:w14="http://schemas.microsoft.com/office/word/2010/wordml" xmlns:w15="http://schemas.microsoft.com/office/word/2012/wordml" xmlns:w16cex="http://schemas.microsoft.com/office/word/2018/wordml/cex" xmlns:w16cid="http://schemas.microsoft.com/office/word/2016/wordml/cid" xmlns:w16="http://schemas.microsoft.com/office/word/2018/wordml" xmlns:w16du="http://schemas.microsoft.com/office/word/2023/wordml/word16du" xmlns:w16sdtdh="http://schemas.microsoft.com/office/word/2020/wordml/sdtdatahash" xmlns:w16sdtfl="http://schemas.microsoft.com/office/word/2024/wordml/sdtformatlock" xmlns:w16se="http://schemas.microsoft.com/office/word/2015/wordml/symex" xmlns:wpg="http://schemas.microsoft.com/office/word/2010/wordprocessingGroup" xmlns:wpi="http://schemas.microsoft.com/office/word/2010/wordprocessingInk" xmlns:wne="http://schemas.microsoft.com/office/word/2006/wordml" xmlns:wps="http://schemas.microsoft.com/office/word/2010/wordprocessingShape" mc:Ignorable="w14 w15 w16se w16cid w16 w16cex w16sdtdh w16sdtfl w16du wp14">
   <w:abstractNum w:abstractNumId="0" w15:restartNumberingAfterBreak="0">
     <w:nsid w:val="3593057B"/>
     <w:multiLevelType w:val="multilevel"/>
@@ -5096,20 +5006,20 @@
       </w:pPr>
     </w:lvl>
   </w:abstractNum>
-  <w:num w:numId="1">
+  <w:num w:numId="1" w16cid:durableId="1680811913">
     <w:abstractNumId w:val="0"/>
   </w:num>
-  <w:num w:numId="2">
+  <w:num w:numId="2" w16cid:durableId="103960812">
     <w:abstractNumId w:val="2"/>
   </w:num>
-  <w:num w:numId="3">
+  <w:num w:numId="3" w16cid:durableId="1498617826">
     <w:abstractNumId w:val="1"/>
   </w:num>
 </w:numbering>
 </file>
 
 <file path=word/styles.xml><?xml version="1.0" encoding="utf-8"?>
-<w:styles xmlns:mc="http://schemas.openxmlformats.org/markup-compatibility/2006" xmlns:r="http://schemas.openxmlformats.org/officeDocument/2006/relationships" xmlns:w="http://schemas.openxmlformats.org/wordprocessingml/2006/main" xmlns:w14="http://schemas.microsoft.com/office/word/2010/wordml" xmlns:w15="http://schemas.microsoft.com/office/word/2012/wordml" xmlns:w16cid="http://schemas.microsoft.com/office/word/2016/wordml/cid" xmlns:w16se="http://schemas.microsoft.com/office/word/2015/wordml/symex" mc:Ignorable="w14 w15 w16se w16cid">
+<w:styles xmlns:mc="http://schemas.openxmlformats.org/markup-compatibility/2006" xmlns:r="http://schemas.openxmlformats.org/officeDocument/2006/relationships" xmlns:w="http://schemas.openxmlformats.org/wordprocessingml/2006/main" xmlns:w14="http://schemas.microsoft.com/office/word/2010/wordml" xmlns:w15="http://schemas.microsoft.com/office/word/2012/wordml" xmlns:w16cex="http://schemas.microsoft.com/office/word/2018/wordml/cex" xmlns:w16cid="http://schemas.microsoft.com/office/word/2016/wordml/cid" xmlns:w16="http://schemas.microsoft.com/office/word/2018/wordml" xmlns:w16du="http://schemas.microsoft.com/office/word/2023/wordml/word16du" xmlns:w16sdtdh="http://schemas.microsoft.com/office/word/2020/wordml/sdtdatahash" xmlns:w16sdtfl="http://schemas.microsoft.com/office/word/2024/wordml/sdtformatlock" xmlns:w16se="http://schemas.microsoft.com/office/word/2015/wordml/symex" mc:Ignorable="w14 w15 w16se w16cid w16 w16cex w16sdtdh w16sdtfl w16du">
   <w:docDefaults>
     <w:rPrDefault>
       <w:rPr>
@@ -5119,7 +5029,7 @@
     </w:rPrDefault>
     <w:pPrDefault/>
   </w:docDefaults>
-  <w:latentStyles w:defLockedState="0" w:defUIPriority="99" w:defSemiHidden="0" w:defUnhideWhenUsed="0" w:defQFormat="0" w:count="375">
+  <w:latentStyles w:defLockedState="0" w:defUIPriority="99" w:defSemiHidden="0" w:defUnhideWhenUsed="0" w:defQFormat="0" w:count="376">
     <w:lsdException w:name="Normal" w:uiPriority="0" w:qFormat="1"/>
     <w:lsdException w:name="heading 1" w:uiPriority="9" w:qFormat="1"/>
     <w:lsdException w:name="heading 2" w:semiHidden="1" w:uiPriority="9" w:unhideWhenUsed="1" w:qFormat="1"/>
@@ -5492,6 +5402,7 @@
     <w:lsdException w:name="Smart Hyperlink" w:semiHidden="1" w:unhideWhenUsed="1"/>
     <w:lsdException w:name="Hashtag" w:semiHidden="1" w:unhideWhenUsed="1"/>
     <w:lsdException w:name="Unresolved Mention" w:semiHidden="1" w:unhideWhenUsed="1"/>
+    <w:lsdException w:name="Smart Link" w:semiHidden="1" w:unhideWhenUsed="1"/>
   </w:latentStyles>
   <w:style w:type="paragraph" w:default="1" w:styleId="a">
     <w:name w:val="Normal"/>

</xml_diff>